<commit_message>
fix: compress Viatris cover letter and resume to single page, highlight referral
</commit_message>
<xml_diff>
--- a/Resume/Viatris/Navneet_Vishwakarma_Cover_Letter.docx
+++ b/Resume/Viatris/Navneet_Vishwakarma_Cover_Letter.docx
@@ -4,8 +4,7 @@
   <w:body>
     <w:p>
       <w:pPr>
-        <w:spacing w:after="40"/>
-        <w:jc w:val="left"/>
+        <w:spacing w:after="20"/>
       </w:pPr>
       <w:r>
         <w:rPr>
@@ -13,14 +12,168 @@
           <w:b/>
           <w:i w:val="0"/>
           <w:color w:val="16538D"/>
-          <w:sz w:val="32"/>
+          <w:sz w:val="28"/>
         </w:rPr>
         <w:t>NAVNEET VISHWAKARMA</w:t>
       </w:r>
     </w:p>
     <w:p>
       <w:pPr>
-        <w:spacing w:after="20" w:line="260" w:lineRule="exact"/>
+        <w:spacing w:after="20" w:line="240" w:lineRule="exact"/>
+      </w:pPr>
+      <w:r>
+        <w:rPr>
+          <w:rFonts w:ascii="Calibri" w:hAnsi="Calibri"/>
+          <w:b w:val="0"/>
+          <w:i w:val="0"/>
+          <w:color w:val="2D2D2D"/>
+          <w:sz w:val="17"/>
+        </w:rPr>
+        <w:t>+91-84350-61006  |  rajvl132011@gmail.com  |  Satna, MP, India (Willing to Relocate)</w:t>
+      </w:r>
+    </w:p>
+    <w:p>
+      <w:pPr>
+        <w:spacing w:after="80" w:line="240" w:lineRule="exact"/>
+      </w:pPr>
+      <w:r>
+        <w:rPr>
+          <w:rFonts w:ascii="Calibri" w:hAnsi="Calibri"/>
+          <w:b w:val="0"/>
+          <w:i w:val="0"/>
+          <w:color w:val="2D2D2D"/>
+          <w:sz w:val="17"/>
+        </w:rPr>
+        <w:t xml:space="preserve">LinkedIn: </w:t>
+      </w:r>
+      <w:r>
+        <w:rPr>
+          <w:rFonts w:ascii="Calibri" w:hAnsi="Calibri"/>
+          <w:b w:val="0"/>
+          <w:i w:val="0"/>
+          <w:color w:val="16538D"/>
+          <w:sz w:val="17"/>
+        </w:rPr>
+        <w:t>linkedin.com/in/navneet1206</w:t>
+      </w:r>
+      <w:r>
+        <w:rPr>
+          <w:rFonts w:ascii="Calibri" w:hAnsi="Calibri"/>
+          <w:b w:val="0"/>
+          <w:i w:val="0"/>
+          <w:color w:val="2D2D2D"/>
+          <w:sz w:val="17"/>
+        </w:rPr>
+        <w:t xml:space="preserve">  |  GitHub: </w:t>
+      </w:r>
+      <w:r>
+        <w:rPr>
+          <w:rFonts w:ascii="Calibri" w:hAnsi="Calibri"/>
+          <w:b w:val="0"/>
+          <w:i w:val="0"/>
+          <w:color w:val="16538D"/>
+          <w:sz w:val="17"/>
+        </w:rPr>
+        <w:t>github.com/navneetvishwakarma</w:t>
+      </w:r>
+    </w:p>
+    <w:p>
+      <w:pPr>
+        <w:spacing w:before="0" w:after="60" w:line="40" w:lineRule="exact"/>
+        <w:pBdr>
+          <w:bottom w:val="single" w:sz="6000" w:space="1" w:color="165390"/>
+        </w:pBdr>
+      </w:pPr>
+    </w:p>
+    <w:p>
+      <w:pPr>
+        <w:spacing w:before="0" w:after="100" w:line="250" w:lineRule="exact"/>
+      </w:pPr>
+      <w:r>
+        <w:rPr>
+          <w:rFonts w:ascii="Calibri" w:hAnsi="Calibri"/>
+          <w:b w:val="0"/>
+          <w:i w:val="0"/>
+          <w:color w:val="2D2D2D"/>
+          <w:sz w:val="18"/>
+        </w:rPr>
+        <w:t>June 26, 2026</w:t>
+      </w:r>
+    </w:p>
+    <w:p>
+      <w:pPr>
+        <w:spacing w:after="0" w:line="240" w:lineRule="exact"/>
+      </w:pPr>
+      <w:r>
+        <w:rPr>
+          <w:rFonts w:ascii="Calibri" w:hAnsi="Calibri"/>
+          <w:b w:val="0"/>
+          <w:i w:val="0"/>
+          <w:color w:val="2D2D2D"/>
+          <w:sz w:val="18"/>
+        </w:rPr>
+        <w:t xml:space="preserve">Ms. Kajal Singh  |  </w:t>
+      </w:r>
+      <w:r>
+        <w:rPr>
+          <w:rFonts w:ascii="Calibri" w:hAnsi="Calibri"/>
+          <w:b/>
+          <w:i w:val="0"/>
+          <w:color w:val="2D2D2D"/>
+          <w:sz w:val="18"/>
+        </w:rPr>
+        <w:t>Viatris India</w:t>
+      </w:r>
+      <w:r>
+        <w:rPr>
+          <w:rFonts w:ascii="Calibri" w:hAnsi="Calibri"/>
+          <w:b w:val="0"/>
+          <w:i w:val="0"/>
+          <w:color w:val="16538D"/>
+          <w:sz w:val="18"/>
+        </w:rPr>
+        <w:t xml:space="preserve">  |  kajal.singh@viatris.com</w:t>
+      </w:r>
+    </w:p>
+    <w:p>
+      <w:pPr>
+        <w:spacing w:before="100" w:after="100" w:line="240" w:lineRule="exact"/>
+      </w:pPr>
+      <w:r>
+        <w:rPr>
+          <w:rFonts w:ascii="Calibri" w:hAnsi="Calibri"/>
+          <w:b/>
+          <w:i w:val="0"/>
+          <w:color w:val="2D2D2D"/>
+          <w:sz w:val="18"/>
+        </w:rPr>
+        <w:t xml:space="preserve">Subject: </w:t>
+      </w:r>
+      <w:r>
+        <w:rPr>
+          <w:rFonts w:ascii="Calibri" w:hAnsi="Calibri"/>
+          <w:b w:val="0"/>
+          <w:i w:val="0"/>
+          <w:color w:val="2D2D2D"/>
+          <w:sz w:val="18"/>
+        </w:rPr>
+        <w:t xml:space="preserve">Application for IT Support / IT Administrator Role – </w:t>
+      </w:r>
+      <w:r>
+        <w:rPr>
+          <w:rFonts w:ascii="Calibri" w:hAnsi="Calibri"/>
+          <w:b/>
+          <w:i w:val="0"/>
+          <w:color w:val="16538D"/>
+          <w:sz w:val="18"/>
+          <w:shd w:val="clear" w:fill="E8F0FE"/>
+        </w:rPr>
+        <w:t>Referred by Mr. Chirag Sen</w:t>
+      </w:r>
+    </w:p>
+    <w:p>
+      <w:pPr>
+        <w:spacing w:before="0" w:after="80" w:line="250" w:lineRule="exact"/>
       </w:pPr>
       <w:r>
         <w:rPr>
@@ -30,12 +183,312 @@
           <w:color w:val="2D2D2D"/>
           <w:sz w:val="19"/>
         </w:rPr>
-        <w:t>+91-84350-61006  |  rajvl132011@gmail.com</w:t>
+        <w:t>Dear Ms. Singh,</w:t>
       </w:r>
     </w:p>
     <w:p>
       <w:pPr>
-        <w:spacing w:after="20" w:line="260" w:lineRule="exact"/>
+        <w:spacing w:before="0" w:after="80" w:line="240" w:lineRule="exact"/>
+      </w:pPr>
+      <w:r>
+        <w:rPr>
+          <w:rFonts w:ascii="Calibri" w:hAnsi="Calibri"/>
+          <w:b w:val="0"/>
+          <w:i w:val="0"/>
+          <w:color w:val="2D2D2D"/>
+          <w:sz w:val="18"/>
+        </w:rPr>
+        <w:t>I am writing to express my strong interest in the IT Support / IT Administrator position at Viatris, as referred by Mr. Chirag Sen. As a Linux System Administrator with over 2 years of hands-on experience in infrastructure operations, technical support, and system troubleshooting, I am confident that my technical skills, dedication, and eagerness to learn make me a strong fit for this position.</w:t>
+      </w:r>
+    </w:p>
+    <w:p>
+      <w:pPr>
+        <w:spacing w:before="0" w:after="40" w:line="250" w:lineRule="exact"/>
+      </w:pPr>
+      <w:r>
+        <w:rPr>
+          <w:rFonts w:ascii="Calibri" w:hAnsi="Calibri"/>
+          <w:b/>
+          <w:i w:val="0"/>
+          <w:color w:val="16538D"/>
+          <w:sz w:val="18"/>
+        </w:rPr>
+        <w:t>WHY VIATRIS?</w:t>
+      </w:r>
+    </w:p>
+    <w:p>
+      <w:pPr>
+        <w:spacing w:before="0" w:after="80" w:line="240" w:lineRule="exact"/>
+      </w:pPr>
+      <w:r>
+        <w:rPr>
+          <w:rFonts w:ascii="Calibri" w:hAnsi="Calibri"/>
+          <w:b w:val="0"/>
+          <w:i w:val="0"/>
+          <w:color w:val="2D2D2D"/>
+          <w:sz w:val="18"/>
+        </w:rPr>
+        <w:t>Viatris's commitment to improving healthcare access globally resonates deeply with my professional values. I am drawn to the organization's emphasis on operational excellence and its India-based IT operations supporting worldwide healthcare delivery. The opportunity to contribute where technology directly impacts patient outcomes is truly exciting.</w:t>
+      </w:r>
+    </w:p>
+    <w:p>
+      <w:pPr>
+        <w:spacing w:before="0" w:after="40" w:line="250" w:lineRule="exact"/>
+      </w:pPr>
+      <w:r>
+        <w:rPr>
+          <w:rFonts w:ascii="Calibri" w:hAnsi="Calibri"/>
+          <w:b/>
+          <w:i w:val="0"/>
+          <w:color w:val="16538D"/>
+          <w:sz w:val="18"/>
+        </w:rPr>
+        <w:t>WHAT I BRING TO THE ROLE:</w:t>
+      </w:r>
+    </w:p>
+    <w:p>
+      <w:pPr>
+        <w:spacing w:before="0" w:after="40" w:line="240" w:lineRule="exact"/>
+      </w:pPr>
+      <w:r>
+        <w:rPr>
+          <w:rFonts w:ascii="Calibri" w:hAnsi="Calibri"/>
+          <w:b w:val="0"/>
+          <w:i w:val="0"/>
+          <w:color w:val="2D2D2D"/>
+          <w:sz w:val="18"/>
+        </w:rPr>
+        <w:t>In my current role at Savayas Life and Balance Pvt. Ltd., I administer 15+ Linux servers (SLES 15, Ubuntu 22.04) maintaining 99.5% uptime. My experience includes:</w:t>
+      </w:r>
+    </w:p>
+    <w:p>
+      <w:pPr>
+        <w:spacing w:before="10" w:after="10" w:line="230" w:lineRule="exact"/>
+        <w:ind w:left="360" w:hanging="216"/>
+      </w:pPr>
+      <w:r>
+        <w:rPr>
+          <w:rFonts w:ascii="Calibri" w:hAnsi="Calibri"/>
+          <w:b w:val="0"/>
+          <w:i w:val="0"/>
+          <w:color w:val="16538D"/>
+          <w:sz w:val="12"/>
+        </w:rPr>
+        <w:t xml:space="preserve">▪  </w:t>
+      </w:r>
+      <w:r>
+        <w:rPr>
+          <w:rFonts w:ascii="Calibri" w:hAnsi="Calibri"/>
+          <w:b/>
+          <w:i w:val="0"/>
+          <w:color w:val="2D2D2D"/>
+          <w:sz w:val="18"/>
+        </w:rPr>
+        <w:t xml:space="preserve">Incident Resolution: </w:t>
+      </w:r>
+      <w:r>
+        <w:rPr>
+          <w:rFonts w:ascii="Calibri" w:hAnsi="Calibri"/>
+          <w:b w:val="0"/>
+          <w:i w:val="0"/>
+          <w:color w:val="2D2D2D"/>
+          <w:sz w:val="18"/>
+        </w:rPr>
+        <w:t>Resolved 75+ P1/P2 incidents via log analysis and RCA, avg resolution under 2 hours.</w:t>
+      </w:r>
+    </w:p>
+    <w:p>
+      <w:pPr>
+        <w:spacing w:before="10" w:after="10" w:line="230" w:lineRule="exact"/>
+        <w:ind w:left="360" w:hanging="216"/>
+      </w:pPr>
+      <w:r>
+        <w:rPr>
+          <w:rFonts w:ascii="Calibri" w:hAnsi="Calibri"/>
+          <w:b w:val="0"/>
+          <w:i w:val="0"/>
+          <w:color w:val="16538D"/>
+          <w:sz w:val="12"/>
+        </w:rPr>
+        <w:t xml:space="preserve">▪  </w:t>
+      </w:r>
+      <w:r>
+        <w:rPr>
+          <w:rFonts w:ascii="Calibri" w:hAnsi="Calibri"/>
+          <w:b/>
+          <w:i w:val="0"/>
+          <w:color w:val="2D2D2D"/>
+          <w:sz w:val="18"/>
+        </w:rPr>
+        <w:t xml:space="preserve">Automation: </w:t>
+      </w:r>
+      <w:r>
+        <w:rPr>
+          <w:rFonts w:ascii="Calibri" w:hAnsi="Calibri"/>
+          <w:b w:val="0"/>
+          <w:i w:val="0"/>
+          <w:color w:val="2D2D2D"/>
+          <w:sz w:val="18"/>
+        </w:rPr>
+        <w:t>Ansible playbooks and Bash scripts reduced manual effort by 40%, saving 15+ hrs/week.</w:t>
+      </w:r>
+    </w:p>
+    <w:p>
+      <w:pPr>
+        <w:spacing w:before="10" w:after="10" w:line="230" w:lineRule="exact"/>
+        <w:ind w:left="360" w:hanging="216"/>
+      </w:pPr>
+      <w:r>
+        <w:rPr>
+          <w:rFonts w:ascii="Calibri" w:hAnsi="Calibri"/>
+          <w:b w:val="0"/>
+          <w:i w:val="0"/>
+          <w:color w:val="16538D"/>
+          <w:sz w:val="12"/>
+        </w:rPr>
+        <w:t xml:space="preserve">▪  </w:t>
+      </w:r>
+      <w:r>
+        <w:rPr>
+          <w:rFonts w:ascii="Calibri" w:hAnsi="Calibri"/>
+          <w:b/>
+          <w:i w:val="0"/>
+          <w:color w:val="2D2D2D"/>
+          <w:sz w:val="18"/>
+        </w:rPr>
+        <w:t xml:space="preserve">Security: </w:t>
+      </w:r>
+      <w:r>
+        <w:rPr>
+          <w:rFonts w:ascii="Calibri" w:hAnsi="Calibri"/>
+          <w:b w:val="0"/>
+          <w:i w:val="0"/>
+          <w:color w:val="2D2D2D"/>
+          <w:sz w:val="18"/>
+        </w:rPr>
+        <w:t>CIS/NIST-aligned hardening: SSH, firewalls, audit logging, legacy service disablement.</w:t>
+      </w:r>
+    </w:p>
+    <w:p>
+      <w:pPr>
+        <w:spacing w:before="10" w:after="10" w:line="230" w:lineRule="exact"/>
+        <w:ind w:left="360" w:hanging="216"/>
+      </w:pPr>
+      <w:r>
+        <w:rPr>
+          <w:rFonts w:ascii="Calibri" w:hAnsi="Calibri"/>
+          <w:b w:val="0"/>
+          <w:i w:val="0"/>
+          <w:color w:val="16538D"/>
+          <w:sz w:val="12"/>
+        </w:rPr>
+        <w:t xml:space="preserve">▪  </w:t>
+      </w:r>
+      <w:r>
+        <w:rPr>
+          <w:rFonts w:ascii="Calibri" w:hAnsi="Calibri"/>
+          <w:b/>
+          <w:i w:val="0"/>
+          <w:color w:val="2D2D2D"/>
+          <w:sz w:val="18"/>
+        </w:rPr>
+        <w:t xml:space="preserve">End-User Support: </w:t>
+      </w:r>
+      <w:r>
+        <w:rPr>
+          <w:rFonts w:ascii="Calibri" w:hAnsi="Calibri"/>
+          <w:b w:val="0"/>
+          <w:i w:val="0"/>
+          <w:color w:val="2D2D2D"/>
+          <w:sz w:val="18"/>
+        </w:rPr>
+        <w:t>L1/L2 support to 50+ users with 95% first-call resolution rate.</w:t>
+      </w:r>
+    </w:p>
+    <w:p>
+      <w:pPr>
+        <w:spacing w:before="10" w:after="10" w:line="230" w:lineRule="exact"/>
+        <w:ind w:left="360" w:hanging="216"/>
+      </w:pPr>
+      <w:r>
+        <w:rPr>
+          <w:rFonts w:ascii="Calibri" w:hAnsi="Calibri"/>
+          <w:b w:val="0"/>
+          <w:i w:val="0"/>
+          <w:color w:val="16538D"/>
+          <w:sz w:val="12"/>
+        </w:rPr>
+        <w:t xml:space="preserve">▪  </w:t>
+      </w:r>
+      <w:r>
+        <w:rPr>
+          <w:rFonts w:ascii="Calibri" w:hAnsi="Calibri"/>
+          <w:b/>
+          <w:i w:val="0"/>
+          <w:color w:val="2D2D2D"/>
+          <w:sz w:val="18"/>
+        </w:rPr>
+        <w:t xml:space="preserve">Documentation: </w:t>
+      </w:r>
+      <w:r>
+        <w:rPr>
+          <w:rFonts w:ascii="Calibri" w:hAnsi="Calibri"/>
+          <w:b w:val="0"/>
+          <w:i w:val="0"/>
+          <w:color w:val="2D2D2D"/>
+          <w:sz w:val="18"/>
+        </w:rPr>
+        <w:t>Maintained runbooks, SOPs, incident reports, and KB articles.</w:t>
+      </w:r>
+    </w:p>
+    <w:p>
+      <w:pPr>
+        <w:spacing w:before="60" w:after="40" w:line="250" w:lineRule="exact"/>
+      </w:pPr>
+      <w:r>
+        <w:rPr>
+          <w:rFonts w:ascii="Calibri" w:hAnsi="Calibri"/>
+          <w:b/>
+          <w:i w:val="0"/>
+          <w:color w:val="16538D"/>
+          <w:sz w:val="18"/>
+        </w:rPr>
+        <w:t>BEYOND TECHNICAL SKILLS:</w:t>
+      </w:r>
+    </w:p>
+    <w:p>
+      <w:pPr>
+        <w:spacing w:before="0" w:after="60" w:line="240" w:lineRule="exact"/>
+      </w:pPr>
+      <w:r>
+        <w:rPr>
+          <w:rFonts w:ascii="Calibri" w:hAnsi="Calibri"/>
+          <w:b w:val="0"/>
+          <w:i w:val="0"/>
+          <w:color w:val="2D2D2D"/>
+          <w:sz w:val="18"/>
+        </w:rPr>
+        <w:t>I pride myself on clear communication, collaborative problem-solving, and a customer-first approach. In a healthcare organization like Viatris, every minute of uptime matters. I am committed to maximum availability, rapid incident response, and proactive monitoring.</w:t>
+      </w:r>
+    </w:p>
+    <w:p>
+      <w:pPr>
+        <w:spacing w:before="0" w:after="120" w:line="240" w:lineRule="exact"/>
+      </w:pPr>
+      <w:r>
+        <w:rPr>
+          <w:rFonts w:ascii="Calibri" w:hAnsi="Calibri"/>
+          <w:b w:val="0"/>
+          <w:i w:val="0"/>
+          <w:color w:val="2D2D2D"/>
+          <w:sz w:val="18"/>
+        </w:rPr>
+        <w:t>I would be grateful for the opportunity to discuss my candidature further. Thank you for your time and consideration.</w:t>
+      </w:r>
+    </w:p>
+    <w:p>
+      <w:pPr>
+        <w:spacing w:before="0" w:after="80" w:line="250" w:lineRule="exact"/>
       </w:pPr>
       <w:r>
         <w:rPr>
@@ -45,12 +498,27 @@
           <w:color w:val="2D2D2D"/>
           <w:sz w:val="19"/>
         </w:rPr>
-        <w:t>Satna, Madhya Pradesh, India (Willing to Relocate)</w:t>
+        <w:t>Warm regards,</w:t>
       </w:r>
     </w:p>
     <w:p>
       <w:pPr>
-        <w:spacing w:after="120" w:line="260" w:lineRule="exact"/>
+        <w:spacing w:after="20" w:line="240" w:lineRule="exact"/>
+      </w:pPr>
+      <w:r>
+        <w:rPr>
+          <w:rFonts w:ascii="Calibri" w:hAnsi="Calibri"/>
+          <w:b/>
+          <w:i w:val="0"/>
+          <w:color w:val="2D2D2D"/>
+          <w:sz w:val="19"/>
+        </w:rPr>
+        <w:t>Navneet Vishwakarma</w:t>
+      </w:r>
+    </w:p>
+    <w:p>
+      <w:pPr>
+        <w:spacing w:after="20" w:line="220" w:lineRule="exact"/>
       </w:pPr>
       <w:r>
         <w:rPr>
@@ -58,7 +526,22 @@
           <w:b w:val="0"/>
           <w:i w:val="0"/>
           <w:color w:val="2D2D2D"/>
-          <w:sz w:val="19"/>
+          <w:sz w:val="17"/>
+        </w:rPr>
+        <w:t>+91-84350-61006  |  rajvl132011@gmail.com</w:t>
+      </w:r>
+    </w:p>
+    <w:p>
+      <w:pPr>
+        <w:spacing w:after="80" w:line="220" w:lineRule="exact"/>
+      </w:pPr>
+      <w:r>
+        <w:rPr>
+          <w:rFonts w:ascii="Calibri" w:hAnsi="Calibri"/>
+          <w:b w:val="0"/>
+          <w:i w:val="0"/>
+          <w:color w:val="2D2D2D"/>
+          <w:sz w:val="17"/>
         </w:rPr>
         <w:t xml:space="preserve">LinkedIn: </w:t>
       </w:r>
@@ -68,7 +551,7 @@
           <w:b w:val="0"/>
           <w:i w:val="0"/>
           <w:color w:val="16538D"/>
-          <w:sz w:val="19"/>
+          <w:sz w:val="17"/>
         </w:rPr>
         <w:t>linkedin.com/in/navneet1206</w:t>
       </w:r>
@@ -78,7 +561,7 @@
           <w:b w:val="0"/>
           <w:i w:val="0"/>
           <w:color w:val="2D2D2D"/>
-          <w:sz w:val="19"/>
+          <w:sz w:val="17"/>
         </w:rPr>
         <w:t xml:space="preserve">  |  GitHub: </w:t>
       </w:r>
@@ -88,577 +571,29 @@
           <w:b w:val="0"/>
           <w:i w:val="0"/>
           <w:color w:val="16538D"/>
-          <w:sz w:val="19"/>
+          <w:sz w:val="17"/>
         </w:rPr>
         <w:t>github.com/navneetvishwakarma</w:t>
       </w:r>
     </w:p>
     <w:p>
       <w:pPr>
-        <w:spacing w:before="0" w:after="80" w:line="40" w:lineRule="exact"/>
-        <w:pBdr>
-          <w:bottom w:val="single" w:sz="8000" w:space="1" w:color="165390"/>
-        </w:pBdr>
-      </w:pPr>
-    </w:p>
-    <w:p>
-      <w:pPr>
-        <w:spacing w:before="120" w:after="200" w:line="280" w:lineRule="exact"/>
-      </w:pPr>
-      <w:r>
-        <w:rPr>
-          <w:rFonts w:ascii="Calibri" w:hAnsi="Calibri"/>
-          <w:b w:val="0"/>
-          <w:i w:val="0"/>
-          <w:color w:val="2D2D2D"/>
-          <w:sz w:val="21"/>
-        </w:rPr>
-        <w:t>June 26, 2026</w:t>
-      </w:r>
-    </w:p>
-    <w:p>
-      <w:pPr>
-        <w:spacing w:before="0" w:after="20" w:line="280" w:lineRule="exact"/>
+        <w:spacing w:before="40" w:after="0" w:line="240" w:lineRule="exact"/>
       </w:pPr>
       <w:r>
         <w:rPr>
           <w:rFonts w:ascii="Calibri" w:hAnsi="Calibri"/>
           <w:b/>
-          <w:i w:val="0"/>
-          <w:color w:val="2D2D2D"/>
-          <w:sz w:val="21"/>
-        </w:rPr>
-        <w:t>Ms. Kajal Singh</w:t>
-      </w:r>
-    </w:p>
-    <w:p>
-      <w:pPr>
-        <w:spacing w:before="0" w:after="20" w:line="280" w:lineRule="exact"/>
-      </w:pPr>
-      <w:r>
-        <w:rPr>
-          <w:rFonts w:ascii="Calibri" w:hAnsi="Calibri"/>
-          <w:b w:val="0"/>
-          <w:i w:val="0"/>
-          <w:color w:val="2D2D2D"/>
-          <w:sz w:val="21"/>
-        </w:rPr>
-        <w:t>Viatris India</w:t>
-      </w:r>
-    </w:p>
-    <w:p>
-      <w:pPr>
-        <w:spacing w:before="0" w:after="160" w:line="280" w:lineRule="exact"/>
-      </w:pPr>
-      <w:r>
-        <w:rPr>
-          <w:rFonts w:ascii="Calibri" w:hAnsi="Calibri"/>
-          <w:b w:val="0"/>
-          <w:i w:val="0"/>
-          <w:color w:val="16538D"/>
-          <w:sz w:val="21"/>
-        </w:rPr>
-        <w:t>Email: kajal.singh@viatris.com</w:t>
-      </w:r>
-    </w:p>
-    <w:p>
-      <w:pPr>
-        <w:spacing w:after="200" w:line="280" w:lineRule="exact"/>
-      </w:pPr>
-      <w:r>
-        <w:rPr>
-          <w:rFonts w:ascii="Calibri" w:hAnsi="Calibri"/>
-          <w:b/>
-          <w:i w:val="0"/>
-          <w:color w:val="2D2D2D"/>
-          <w:sz w:val="21"/>
-        </w:rPr>
-        <w:t xml:space="preserve">Subject: </w:t>
-      </w:r>
-      <w:r>
-        <w:rPr>
-          <w:rFonts w:ascii="Calibri" w:hAnsi="Calibri"/>
-          <w:b w:val="0"/>
-          <w:i w:val="0"/>
-          <w:color w:val="2D2D2D"/>
-          <w:sz w:val="21"/>
-        </w:rPr>
-        <w:t>Application for IT Support / IT Administrator Role – Referred by Mr. Chirag Sen</w:t>
-      </w:r>
-    </w:p>
-    <w:p>
-      <w:pPr>
-        <w:spacing w:before="0" w:after="160" w:line="280" w:lineRule="exact"/>
-      </w:pPr>
-      <w:r>
-        <w:rPr>
-          <w:rFonts w:ascii="Calibri" w:hAnsi="Calibri"/>
-          <w:b w:val="0"/>
-          <w:i w:val="0"/>
-          <w:color w:val="2D2D2D"/>
-          <w:sz w:val="21"/>
-        </w:rPr>
-        <w:t>Dear Ms. Singh,</w:t>
-      </w:r>
-    </w:p>
-    <w:p>
-      <w:pPr>
-        <w:spacing w:before="0" w:after="160" w:line="280" w:lineRule="exact"/>
-      </w:pPr>
-      <w:r>
-        <w:rPr>
-          <w:rFonts w:ascii="Calibri" w:hAnsi="Calibri"/>
-          <w:b w:val="0"/>
-          <w:i w:val="0"/>
-          <w:color w:val="2D2D2D"/>
-          <w:sz w:val="21"/>
-        </w:rPr>
-        <w:t>I am writing to express my strong interest in the IT Support / IT Administrator position at Viatris, as referred by Mr. Chirag Sen. As a Linux System Administrator with over 2 years of hands-on experience in infrastructure operations, technical support, and system troubleshooting, I am confident that my technical skills, dedication, and eagerness to learn make me a strong fit for this position.</w:t>
-      </w:r>
-    </w:p>
-    <w:p>
-      <w:pPr>
-        <w:spacing w:before="0" w:after="80" w:line="280" w:lineRule="exact"/>
-      </w:pPr>
-      <w:r>
-        <w:rPr>
-          <w:rFonts w:ascii="Calibri" w:hAnsi="Calibri"/>
-          <w:b/>
-          <w:i w:val="0"/>
-          <w:color w:val="16538D"/>
-          <w:sz w:val="21"/>
-        </w:rPr>
-        <w:t>WHY VIATRIS?</w:t>
-      </w:r>
-    </w:p>
-    <w:p>
-      <w:pPr>
-        <w:spacing w:before="0" w:after="160" w:line="280" w:lineRule="exact"/>
-      </w:pPr>
-      <w:r>
-        <w:rPr>
-          <w:rFonts w:ascii="Calibri" w:hAnsi="Calibri"/>
-          <w:b w:val="0"/>
-          <w:i w:val="0"/>
-          <w:color w:val="2D2D2D"/>
-          <w:sz w:val="21"/>
-        </w:rPr>
-        <w:t>Viatris's commitment to improving healthcare access globally resonates deeply with my professional values. I am particularly drawn to the organization's emphasis on operational excellence and its India-based IT operations supporting worldwide healthcare delivery. The opportunity to contribute my technical expertise to a company where technology directly impacts patient outcomes is truly exciting to me.</w:t>
-      </w:r>
-    </w:p>
-    <w:p>
-      <w:pPr>
-        <w:spacing w:before="0" w:after="80" w:line="280" w:lineRule="exact"/>
-      </w:pPr>
-      <w:r>
-        <w:rPr>
-          <w:rFonts w:ascii="Calibri" w:hAnsi="Calibri"/>
-          <w:b/>
-          <w:i w:val="0"/>
-          <w:color w:val="16538D"/>
-          <w:sz w:val="21"/>
-        </w:rPr>
-        <w:t>WHAT I BRING TO THE ROLE:</w:t>
-      </w:r>
-    </w:p>
-    <w:p>
-      <w:pPr>
-        <w:spacing w:before="0" w:after="80" w:line="280" w:lineRule="exact"/>
-      </w:pPr>
-      <w:r>
-        <w:rPr>
-          <w:rFonts w:ascii="Calibri" w:hAnsi="Calibri"/>
-          <w:b w:val="0"/>
-          <w:i w:val="0"/>
-          <w:color w:val="2D2D2D"/>
-          <w:sz w:val="21"/>
-        </w:rPr>
-        <w:t>In my current role at Savayas Life and Balance Pvt. Ltd., I administer 15+ Linux servers (SLES 15, Ubuntu 22.04) maintaining 99.5% uptime across production and staging environments. My experience includes:</w:t>
-      </w:r>
-    </w:p>
-    <w:p>
-      <w:pPr>
-        <w:spacing w:before="20" w:after="20" w:line="260" w:lineRule="exact"/>
-        <w:ind w:left="432" w:hanging="216"/>
-      </w:pPr>
-      <w:r>
-        <w:rPr>
-          <w:rFonts w:ascii="Calibri" w:hAnsi="Calibri"/>
-          <w:b w:val="0"/>
-          <w:i w:val="0"/>
-          <w:color w:val="16538D"/>
-          <w:sz w:val="14"/>
-        </w:rPr>
-        <w:t xml:space="preserve">▪  </w:t>
-      </w:r>
-      <w:r>
-        <w:rPr>
-          <w:rFonts w:ascii="Calibri" w:hAnsi="Calibri"/>
-          <w:b/>
-          <w:i w:val="0"/>
-          <w:color w:val="2D2D2D"/>
-          <w:sz w:val="20"/>
-        </w:rPr>
-        <w:t xml:space="preserve">Incident Resolution: </w:t>
-      </w:r>
-      <w:r>
-        <w:rPr>
-          <w:rFonts w:ascii="Calibri" w:hAnsi="Calibri"/>
-          <w:b w:val="0"/>
-          <w:i w:val="0"/>
-          <w:color w:val="2D2D2D"/>
-          <w:sz w:val="20"/>
-        </w:rPr>
-        <w:t>Resolved 75+ P1/P2 operational incidents through systematic log analysis and root cause investigation, with an average resolution time under 2 hours.</w:t>
-      </w:r>
-    </w:p>
-    <w:p>
-      <w:pPr>
-        <w:spacing w:before="20" w:after="20" w:line="260" w:lineRule="exact"/>
-        <w:ind w:left="432" w:hanging="216"/>
-      </w:pPr>
-      <w:r>
-        <w:rPr>
-          <w:rFonts w:ascii="Calibri" w:hAnsi="Calibri"/>
-          <w:b w:val="0"/>
-          <w:i w:val="0"/>
-          <w:color w:val="16538D"/>
-          <w:sz w:val="14"/>
-        </w:rPr>
-        <w:t xml:space="preserve">▪  </w:t>
-      </w:r>
-      <w:r>
-        <w:rPr>
-          <w:rFonts w:ascii="Calibri" w:hAnsi="Calibri"/>
-          <w:b/>
-          <w:i w:val="0"/>
-          <w:color w:val="2D2D2D"/>
-          <w:sz w:val="20"/>
-        </w:rPr>
-        <w:t xml:space="preserve">Automation &amp; Efficiency: </w:t>
-      </w:r>
-      <w:r>
-        <w:rPr>
-          <w:rFonts w:ascii="Calibri" w:hAnsi="Calibri"/>
-          <w:b w:val="0"/>
-          <w:i w:val="0"/>
-          <w:color w:val="2D2D2D"/>
-          <w:sz w:val="20"/>
-        </w:rPr>
-        <w:t>Built Ansible playbooks and Bash scripts that reduced manual administration effort by 40%, saving 15+ hours weekly and allowing the team to focus on strategic initiatives.</w:t>
-      </w:r>
-    </w:p>
-    <w:p>
-      <w:pPr>
-        <w:spacing w:before="20" w:after="20" w:line="260" w:lineRule="exact"/>
-        <w:ind w:left="432" w:hanging="216"/>
-      </w:pPr>
-      <w:r>
-        <w:rPr>
-          <w:rFonts w:ascii="Calibri" w:hAnsi="Calibri"/>
-          <w:b w:val="0"/>
-          <w:i w:val="0"/>
-          <w:color w:val="16538D"/>
-          <w:sz w:val="14"/>
-        </w:rPr>
-        <w:t xml:space="preserve">▪  </w:t>
-      </w:r>
-      <w:r>
-        <w:rPr>
-          <w:rFonts w:ascii="Calibri" w:hAnsi="Calibri"/>
-          <w:b/>
-          <w:i w:val="0"/>
-          <w:color w:val="2D2D2D"/>
-          <w:sz w:val="20"/>
-        </w:rPr>
-        <w:t xml:space="preserve">Security &amp; Compliance: </w:t>
-      </w:r>
-      <w:r>
-        <w:rPr>
-          <w:rFonts w:ascii="Calibri" w:hAnsi="Calibri"/>
-          <w:b w:val="0"/>
-          <w:i w:val="0"/>
-          <w:color w:val="2D2D2D"/>
-          <w:sz w:val="20"/>
-        </w:rPr>
-        <w:t>Implemented CIS/NIST-aligned server hardening across the entire infrastructure, including SSH hardening, firewall enforcement, audit logging, and legacy service disablement.</w:t>
-      </w:r>
-    </w:p>
-    <w:p>
-      <w:pPr>
-        <w:spacing w:before="20" w:after="20" w:line="260" w:lineRule="exact"/>
-        <w:ind w:left="432" w:hanging="216"/>
-      </w:pPr>
-      <w:r>
-        <w:rPr>
-          <w:rFonts w:ascii="Calibri" w:hAnsi="Calibri"/>
-          <w:b w:val="0"/>
-          <w:i w:val="0"/>
-          <w:color w:val="16538D"/>
-          <w:sz w:val="14"/>
-        </w:rPr>
-        <w:t xml:space="preserve">▪  </w:t>
-      </w:r>
-      <w:r>
-        <w:rPr>
-          <w:rFonts w:ascii="Calibri" w:hAnsi="Calibri"/>
-          <w:b/>
-          <w:i w:val="0"/>
-          <w:color w:val="2D2D2D"/>
-          <w:sz w:val="20"/>
-        </w:rPr>
-        <w:t xml:space="preserve">End-User Support: </w:t>
-      </w:r>
-      <w:r>
-        <w:rPr>
-          <w:rFonts w:ascii="Calibri" w:hAnsi="Calibri"/>
-          <w:b w:val="0"/>
-          <w:i w:val="0"/>
-          <w:color w:val="2D2D2D"/>
-          <w:sz w:val="20"/>
-        </w:rPr>
-        <w:t>Provided L1/L2 technical support to 50+ end-users, achieving a 95% first-call resolution rate and ensuring minimal business disruption.</w:t>
-      </w:r>
-    </w:p>
-    <w:p>
-      <w:pPr>
-        <w:spacing w:before="20" w:after="20" w:line="260" w:lineRule="exact"/>
-        <w:ind w:left="432" w:hanging="216"/>
-      </w:pPr>
-      <w:r>
-        <w:rPr>
-          <w:rFonts w:ascii="Calibri" w:hAnsi="Calibri"/>
-          <w:b w:val="0"/>
-          <w:i w:val="0"/>
-          <w:color w:val="16538D"/>
-          <w:sz w:val="14"/>
-        </w:rPr>
-        <w:t xml:space="preserve">▪  </w:t>
-      </w:r>
-      <w:r>
-        <w:rPr>
-          <w:rFonts w:ascii="Calibri" w:hAnsi="Calibri"/>
-          <w:b/>
-          <w:i w:val="0"/>
-          <w:color w:val="2D2D2D"/>
-          <w:sz w:val="20"/>
-        </w:rPr>
-        <w:t xml:space="preserve">Documentation: </w:t>
-      </w:r>
-      <w:r>
-        <w:rPr>
-          <w:rFonts w:ascii="Calibri" w:hAnsi="Calibri"/>
-          <w:b w:val="0"/>
-          <w:i w:val="0"/>
-          <w:color w:val="2D2D2D"/>
-          <w:sz w:val="20"/>
-        </w:rPr>
-        <w:t>Maintained comprehensive operational documentation including runbooks, SOPs, incident reports, and knowledge base articles for team reference and continuity.</w:t>
-      </w:r>
-    </w:p>
-    <w:p>
-      <w:pPr>
-        <w:spacing w:before="120" w:after="160" w:line="280" w:lineRule="exact"/>
-      </w:pPr>
-      <w:r>
-        <w:rPr>
-          <w:rFonts w:ascii="Calibri" w:hAnsi="Calibri"/>
-          <w:b w:val="0"/>
-          <w:i w:val="0"/>
-          <w:color w:val="2D2D2D"/>
-          <w:sz w:val="21"/>
-        </w:rPr>
-        <w:t>My technical toolkit includes SUSE Linux Enterprise Server, Ubuntu, Ansible, Docker, Bash scripting, TCP/IP networking, firewall management, and system monitoring – all directly applicable to maintaining Viatris's secure, reliable, and scalable IT infrastructure.</w:t>
-      </w:r>
-    </w:p>
-    <w:p>
-      <w:pPr>
-        <w:spacing w:before="0" w:after="80" w:line="280" w:lineRule="exact"/>
-      </w:pPr>
-      <w:r>
-        <w:rPr>
-          <w:rFonts w:ascii="Calibri" w:hAnsi="Calibri"/>
-          <w:b/>
-          <w:i w:val="0"/>
-          <w:color w:val="16538D"/>
-          <w:sz w:val="21"/>
-        </w:rPr>
-        <w:t>BEYOND TECHNICAL SKILLS:</w:t>
-      </w:r>
-    </w:p>
-    <w:p>
-      <w:pPr>
-        <w:spacing w:before="0" w:after="160" w:line="280" w:lineRule="exact"/>
-      </w:pPr>
-      <w:r>
-        <w:rPr>
-          <w:rFonts w:ascii="Calibri" w:hAnsi="Calibri"/>
-          <w:b w:val="0"/>
-          <w:i w:val="0"/>
-          <w:color w:val="2D2D2D"/>
-          <w:sz w:val="21"/>
-        </w:rPr>
-        <w:t>I pride myself on clear communication, collaborative problem-solving, and a customer-first approach to IT support. I understand that in a healthcare-focused organization like Viatris, every minute of system downtime can impact critical operations. I am committed to ensuring maximum availability, rapid incident response, and proactive system monitoring.</w:t>
-      </w:r>
-    </w:p>
-    <w:p>
-      <w:pPr>
-        <w:spacing w:before="0" w:after="120" w:line="280" w:lineRule="exact"/>
-      </w:pPr>
-      <w:r>
-        <w:rPr>
-          <w:rFonts w:ascii="Calibri" w:hAnsi="Calibri"/>
-          <w:b w:val="0"/>
-          <w:i w:val="0"/>
-          <w:color w:val="2D2D2D"/>
-          <w:sz w:val="21"/>
-        </w:rPr>
-        <w:t>If given the opportunity, I will give my best and contribute effectively to your team. I am eager to bring my skills in Linux administration, infrastructure automation, and technical support to support Viatris's mission of empowering people to live healthier at every stage of life.</w:t>
-      </w:r>
-    </w:p>
-    <w:p>
-      <w:pPr>
-        <w:spacing w:before="0" w:after="240" w:line="280" w:lineRule="exact"/>
-      </w:pPr>
-      <w:r>
-        <w:rPr>
-          <w:rFonts w:ascii="Calibri" w:hAnsi="Calibri"/>
-          <w:b w:val="0"/>
-          <w:i w:val="0"/>
-          <w:color w:val="2D2D2D"/>
-          <w:sz w:val="21"/>
-        </w:rPr>
-        <w:t>I would be grateful for the opportunity to discuss my candidature further. Thank you for your time and consideration. I look forward to hearing from you.</w:t>
-      </w:r>
-    </w:p>
-    <w:p>
-      <w:pPr>
-        <w:spacing w:before="0" w:after="200" w:line="280" w:lineRule="exact"/>
-      </w:pPr>
-      <w:r>
-        <w:rPr>
-          <w:rFonts w:ascii="Calibri" w:hAnsi="Calibri"/>
-          <w:b w:val="0"/>
-          <w:i w:val="0"/>
-          <w:color w:val="2D2D2D"/>
-          <w:sz w:val="21"/>
-        </w:rPr>
-        <w:t>Warm regards,</w:t>
-      </w:r>
-    </w:p>
-    <w:p>
-      <w:pPr>
-        <w:spacing w:before="0" w:after="20" w:line="280" w:lineRule="exact"/>
-      </w:pPr>
-      <w:r>
-        <w:rPr>
-          <w:rFonts w:ascii="Calibri" w:hAnsi="Calibri"/>
-          <w:b/>
-          <w:i w:val="0"/>
-          <w:color w:val="2D2D2D"/>
-          <w:sz w:val="21"/>
-        </w:rPr>
-        <w:t>Navneet Vishwakarma</w:t>
-      </w:r>
-    </w:p>
-    <w:p>
-      <w:pPr>
-        <w:spacing w:before="0" w:after="20" w:line="280" w:lineRule="exact"/>
-      </w:pPr>
-      <w:r>
-        <w:rPr>
-          <w:rFonts w:ascii="Calibri" w:hAnsi="Calibri"/>
-          <w:b w:val="0"/>
-          <w:i w:val="0"/>
-          <w:color w:val="2D2D2D"/>
-          <w:sz w:val="19"/>
-        </w:rPr>
-        <w:t>+91-84350-61006</w:t>
-      </w:r>
-    </w:p>
-    <w:p>
-      <w:pPr>
-        <w:spacing w:before="0" w:after="20" w:line="280" w:lineRule="exact"/>
-      </w:pPr>
-      <w:r>
-        <w:rPr>
-          <w:rFonts w:ascii="Calibri" w:hAnsi="Calibri"/>
-          <w:b w:val="0"/>
-          <w:i w:val="0"/>
           <w:color w:val="16538D"/>
           <w:sz w:val="19"/>
+          <w:shd w:val="clear" w:fill="E8F0FE"/>
         </w:rPr>
-        <w:t>rajvl132011@gmail.com</w:t>
-      </w:r>
-    </w:p>
-    <w:p>
-      <w:pPr>
-        <w:spacing w:after="20" w:line="260" w:lineRule="exact"/>
-      </w:pPr>
-      <w:r>
-        <w:rPr>
-          <w:rFonts w:ascii="Calibri" w:hAnsi="Calibri"/>
-          <w:b w:val="0"/>
-          <w:i w:val="0"/>
-          <w:color w:val="2D2D2D"/>
-          <w:sz w:val="19"/>
-        </w:rPr>
-        <w:t xml:space="preserve">LinkedIn: </w:t>
-      </w:r>
-      <w:r>
-        <w:rPr>
-          <w:rFonts w:ascii="Calibri" w:hAnsi="Calibri"/>
-          <w:b w:val="0"/>
-          <w:i w:val="0"/>
-          <w:color w:val="16538D"/>
-          <w:sz w:val="19"/>
-        </w:rPr>
-        <w:t>linkedin.com/in/navneet1206</w:t>
-      </w:r>
-    </w:p>
-    <w:p>
-      <w:pPr>
-        <w:spacing w:after="160" w:line="260" w:lineRule="exact"/>
-      </w:pPr>
-      <w:r>
-        <w:rPr>
-          <w:rFonts w:ascii="Calibri" w:hAnsi="Calibri"/>
-          <w:b w:val="0"/>
-          <w:i w:val="0"/>
-          <w:color w:val="2D2D2D"/>
-          <w:sz w:val="19"/>
-        </w:rPr>
-        <w:t xml:space="preserve">GitHub: </w:t>
-      </w:r>
-      <w:r>
-        <w:rPr>
-          <w:rFonts w:ascii="Calibri" w:hAnsi="Calibri"/>
-          <w:b w:val="0"/>
-          <w:i w:val="0"/>
-          <w:color w:val="16538D"/>
-          <w:sz w:val="19"/>
-        </w:rPr>
-        <w:t>github.com/navneetvishwakarma</w:t>
-      </w:r>
-    </w:p>
-    <w:p>
-      <w:pPr>
-        <w:spacing w:before="0" w:after="80" w:line="280" w:lineRule="exact"/>
-      </w:pPr>
-      <w:r>
-        <w:rPr>
-          <w:rFonts w:ascii="Calibri" w:hAnsi="Calibri"/>
-          <w:b w:val="0"/>
-          <w:i/>
-          <w:color w:val="555555"/>
-          <w:sz w:val="19"/>
-        </w:rPr>
-        <w:t>Referred by: Mr. Chirag Sen</w:t>
+        <w:t xml:space="preserve">  Referred by: Mr. Chirag Sen  </w:t>
       </w:r>
     </w:p>
     <w:sectPr>
       <w:pgSz w:w="11909" w:h="16834"/>
-      <w:pgMar w:top="1134" w:right="1417" w:bottom="1134" w:left="1417" w:header="720" w:footer="720" w:gutter="0"/>
+      <w:pgMar w:top="850" w:right="1134" w:bottom="680" w:left="1134" w:header="720" w:footer="720" w:gutter="0"/>
       <w:cols w:space="720"/>
       <w:docGrid w:linePitch="360"/>
     </w:sectPr>
@@ -1035,7 +970,7 @@
     <w:rPr>
       <w:rFonts w:ascii="Calibri" w:hAnsi="Calibri"/>
       <w:color w:val="2D2D2D"/>
-      <w:sz w:val="21"/>
+      <w:sz w:val="19"/>
     </w:rPr>
   </w:style>
   <w:style w:type="paragraph" w:styleId="Header">

</xml_diff>